<commit_message>
Recommendations 2–3: the side-by-side ratio check requires the audit unit to be the payment unit; where frames differ (Part D) the check is the within-stratum error pattern and the simulation with vs without decile donor kinds
Co-Authored-By: Claude Fable 5.1 <noreply@anthropic.com>
Claude-Session: https://claude.ai/code/session_01E9gM2NCfgWbC8R2dx5TDHN
</commit_message>
<xml_diff>
--- a/manuscripts/conference-abstract.docx
+++ b/manuscripts/conference-abstract.docx
@@ -181,7 +181,7 @@
         <w:t xml:space="preserve"> </w:t>
       </w:r>
       <w:r>
-        <w:t xml:space="preserve">Monte Carlo evaluation against a known truth. A synthetic population per program, with fabricated errors, was calibrated only to public FY 2025 aggregates. Each program’s production-like audit (990–37,651 units) was drawn in 25 independent audit years, and in 100 for interval calibration. Improper payments were estimated with expansion, ratio, and regression estimators and with simulation (1,000 iterations) in two versions: plug-in (audited error rates held fixed) and parametric bootstrap (rates redrawn from their binomial sampling distributions). Each population was then rebuilt with error probability rising, and falling, with payment size within strata. Outcomes were point accuracy, coverage, width, and the ratio of half-width to the estimator’s empirical standard deviation.</w:t>
+        <w:t xml:space="preserve">Monte Carlo evaluation against a known truth. A synthetic population per program, with fabricated errors, was calibrated only to public FY 2025 aggregates. Each program’s production-like audit (990–37,651 units) was drawn in 25 independent audit years, and in 100 for interval calibration. Improper payments were estimated with expansion, ratio, and regression estimators and with simulation (1,000 iterations) in two versions: plug-in (audited error rates held fixed) and parametric bootstrap (rates redrawn from their binomial sampling distributions). Each population was then rebuilt with error probability rising, and falling, with payment size within strata, and the simulation rerun with donor kinds post-stratified on payment decile. Outcomes were point accuracy, coverage, width, and half-width relative to the estimator’s empirical standard deviation.</w:t>
       </w:r>
     </w:p>
     <w:p>
@@ -255,7 +255,7 @@
         <w:t xml:space="preserve"> </w:t>
       </w:r>
       <w:r>
-        <w:t xml:space="preserve">They contained the true gross rate in 121 of 125 audit years and were 9–23% narrower than the ratio interval in four programs. Over 100 audit years they were 5–12% narrower than the estimator’s own sampling variability in four programs; the real efficiency gain over the ratio estimator was 3% (Part C), 4% (EIPM), 23% (PERM), 35% (CERT), and 72% (Part D).</w:t>
+        <w:t xml:space="preserve">They contained the true gross rate in 121 of 125 audit years and were 9–23% narrower than the ratio interval in four programs; over 100 audit years the simulation’s standard deviation was 3–4% (Part C, EIPM) to 23–72% (PERM, CERT, Part D) below the ratio estimator’s.</w:t>
       </w:r>
       <w:r>
         <w:t xml:space="preserve"> </w:t>
@@ -271,13 +271,13 @@
           <w:bCs/>
           <w:b/>
         </w:rPr>
-        <w:t xml:space="preserve">The simulation’s advantage depends on an assumption.</w:t>
-      </w:r>
-      <w:r>
-        <w:t xml:space="preserve"> </w:t>
-      </w:r>
-      <w:r>
-        <w:t xml:space="preserve">When error probability rose or fell with payment size, the simulation’s estimate was biased by 2% to 148% and its interval covered in 0 to 24 of 25 audit years; the ratio estimator remained unbiased and covered in 22 to 25.</w:t>
+        <w:t xml:space="preserve">The simulation’s advantage rests on one assumption.</w:t>
+      </w:r>
+      <w:r>
+        <w:t xml:space="preserve"> </w:t>
+      </w:r>
+      <w:r>
+        <w:t xml:space="preserve">When error probability rose or fell with payment size, the simulation’s estimate was biased by 2% to 148% and its interval covered in 0 to 24 of 25 audit years; the ratio estimator remained unbiased (22 to 25). Payment-decile donor kinds removed the bias in PERM and most of it in CERT and Part D.</w:t>
       </w:r>
       <w:r>
         <w:t xml:space="preserve"> </w:t>
@@ -317,7 +317,7 @@
         <w:t xml:space="preserve"> </w:t>
       </w:r>
       <w:r>
-        <w:t xml:space="preserve">Plug-in simulation intervals should be discontinued. Redrawing the audited rates produces valid intervals, and the simulation is more precise where payment rules are nonlinear, but its accuracy rests on an independence assumption the design-based ratio estimator does not need.</w:t>
+        <w:t xml:space="preserve">Plug-in simulation intervals should be discontinued. Redrawing the audited rates produces valid intervals, and the simulation is more precise where payment rules are nonlinear, on one assumption the design-based ratio estimator does not need: that error incidence is independent of payment size within each donor kind.</w:t>
       </w:r>
     </w:p>
     <w:p>
@@ -335,7 +335,7 @@
         <w:t xml:space="preserve"> </w:t>
       </w:r>
       <w:r>
-        <w:t xml:space="preserve">CMS measurements should report the design-based ratio interval as the primary PIIA interval, with the parametric-bootstrap simulation alongside it as a check, and any plug-in simulation interval in use should be replaced. The simulation’s precision gain should not be used to reduce audit sizes until the independence assumption has been tested on real audit data and coverage confirmed at the reduced size; unit-level error models are the natural next step.</w:t>
+        <w:t xml:space="preserve">CMS measurements should adopt parametric-bootstrap simulation with the independence assumption stated and tested every cycle (against the design-based ratio estimate where the audit and payment units coincide, and from the within-stratum error pattern where they do not), use payment-decile donor kinds where the test fails, and defer audit-size reductions until the test has passed and coverage is confirmed at the smaller size. Unit-level error models are the natural next step.</w:t>
       </w:r>
     </w:p>
     <w:sectPr/>

</xml_diff>